<commit_message>
Docs: sync database docs and BRD with schema, update web/API docs, remove old slides
</commit_message>
<xml_diff>
--- a/01-proposal/business-requirements.docx
+++ b/01-proposal/business-requirements.docx
@@ -485,7 +485,7 @@
                 <w:sz w:val="19"/>
                 <w:szCs w:val="19"/>
               </w:rPr>
-              <w:t xml:space="preserve">1.0</w:t>
+              <w:t xml:space="preserve">1.1</w:t>
             </w:r>
           </w:p>
         </w:tc>
@@ -557,7 +557,7 @@
                 <w:sz w:val="19"/>
                 <w:szCs w:val="19"/>
               </w:rPr>
-              <w:t xml:space="preserve">19 กันยายน 2569</w:t>
+              <w:t xml:space="preserve">24 กันยายน 2569</w:t>
             </w:r>
           </w:p>
         </w:tc>
@@ -1184,6 +1184,162 @@
                 <w:szCs w:val="19"/>
               </w:rPr>
               <w:t xml:space="preserve">จัดทำฉบับสมบูรณ์ โดยทวนสอบทุกข้อกำหนดกับโครงสร้างฐานข้อมูลจริง (19 ตาราง, 7 วิว, 3 ฟังก์ชัน, 3 ทริกเกอร์) และกับระบบงานที่พัฒนาแล้ว</w:t>
+            </w:r>
+          </w:p>
+        </w:tc>
+      </w:tr>
+      <w:tr>
+        <w:trPr>
+          <w:cantSplit/>
+          <w:tblHeader w:val="false"/>
+        </w:trPr>
+        <w:tc>
+          <w:tcPr>
+            <w:tcW w:type="dxa" w:w="1374"/>
+            <w:tcBorders>
+              <w:top w:val="single" w:color="B9C2CC" w:sz="4"/>
+              <w:left w:val="single" w:color="B9C2CC" w:sz="4"/>
+              <w:bottom w:val="single" w:color="B9C2CC" w:sz="4"/>
+              <w:right w:val="single" w:color="B9C2CC" w:sz="4"/>
+            </w:tcBorders>
+            <w:tcMar>
+              <w:top w:type="dxa" w:w="60"/>
+              <w:left w:type="dxa" w:w="100"/>
+              <w:bottom w:type="dxa" w:w="60"/>
+              <w:right w:type="dxa" w:w="100"/>
+            </w:tcMar>
+            <w:vAlign w:val="center"/>
+          </w:tcPr>
+          <w:p>
+            <w:pPr>
+              <w:keepNext/>
+              <w:spacing w:after="0" w:line="276"/>
+              <w:jc w:val="left"/>
+            </w:pPr>
+            <w:r>
+              <w:rPr>
+                <w:color w:val="1F2933"/>
+                <w:sz w:val="19"/>
+                <w:szCs w:val="19"/>
+              </w:rPr>
+              <w:t xml:space="preserve">1.1</w:t>
+            </w:r>
+          </w:p>
+        </w:tc>
+        <w:tc>
+          <w:tcPr>
+            <w:tcW w:type="dxa" w:w="1814"/>
+            <w:tcBorders>
+              <w:top w:val="single" w:color="B9C2CC" w:sz="4"/>
+              <w:left w:val="single" w:color="B9C2CC" w:sz="4"/>
+              <w:bottom w:val="single" w:color="B9C2CC" w:sz="4"/>
+              <w:right w:val="single" w:color="B9C2CC" w:sz="4"/>
+            </w:tcBorders>
+            <w:tcMar>
+              <w:top w:type="dxa" w:w="60"/>
+              <w:left w:type="dxa" w:w="100"/>
+              <w:bottom w:type="dxa" w:w="60"/>
+              <w:right w:type="dxa" w:w="100"/>
+            </w:tcMar>
+            <w:vAlign w:val="center"/>
+          </w:tcPr>
+          <w:p>
+            <w:pPr>
+              <w:keepNext/>
+              <w:spacing w:after="0" w:line="276"/>
+              <w:jc w:val="left"/>
+            </w:pPr>
+            <w:r>
+              <w:rPr>
+                <w:color w:val="1F2933"/>
+                <w:sz w:val="19"/>
+                <w:szCs w:val="19"/>
+              </w:rPr>
+              <w:t xml:space="preserve">24 กันยายน 2569</w:t>
+            </w:r>
+          </w:p>
+        </w:tc>
+        <w:tc>
+          <w:tcPr>
+            <w:tcW w:type="dxa" w:w="5838"/>
+            <w:tcBorders>
+              <w:top w:val="single" w:color="B9C2CC" w:sz="4"/>
+              <w:left w:val="single" w:color="B9C2CC" w:sz="4"/>
+              <w:bottom w:val="single" w:color="B9C2CC" w:sz="4"/>
+              <w:right w:val="single" w:color="B9C2CC" w:sz="4"/>
+            </w:tcBorders>
+            <w:tcMar>
+              <w:top w:type="dxa" w:w="60"/>
+              <w:left w:type="dxa" w:w="100"/>
+              <w:bottom w:type="dxa" w:w="60"/>
+              <w:right w:type="dxa" w:w="100"/>
+            </w:tcMar>
+            <w:vAlign w:val="center"/>
+          </w:tcPr>
+          <w:p>
+            <w:pPr>
+              <w:keepNext/>
+              <w:spacing w:after="0" w:line="276"/>
+              <w:jc w:val="left"/>
+            </w:pPr>
+            <w:r>
+              <w:rPr>
+                <w:color w:val="1F2933"/>
+                <w:sz w:val="19"/>
+                <w:szCs w:val="19"/>
+              </w:rPr>
+              <w:t xml:space="preserve">แก้ตามรายงานทดสอบ: BR-5 กันการจองซ้อนเมื่อทำรายการพร้อมกันและเมื่อแก้ตาราง </w:t>
+            </w:r>
+            <w:r>
+              <w:rPr>
+                <w:rFonts w:ascii="Consolas" w:cs="Consolas" w:eastAsia="Consolas" w:hAnsi="Consolas"/>
+                <w:color w:val="3B4B5C"/>
+                <w:sz w:val="17"/>
+                <w:szCs w:val="17"/>
+              </w:rPr>
+              <w:t xml:space="preserve">booking</w:t>
+            </w:r>
+            <w:r>
+              <w:rPr>
+                <w:color w:val="1F2933"/>
+                <w:sz w:val="19"/>
+                <w:szCs w:val="19"/>
+              </w:rPr>
+              <w:t xml:space="preserve"> โดยตรง, BR-9 วิว </w:t>
+            </w:r>
+            <w:r>
+              <w:rPr>
+                <w:rFonts w:ascii="Consolas" w:cs="Consolas" w:eastAsia="Consolas" w:hAnsi="Consolas"/>
+                <w:color w:val="3B4B5C"/>
+                <w:sz w:val="17"/>
+                <w:szCs w:val="17"/>
+              </w:rPr>
+              <w:t xml:space="preserve">v_booking_bill</w:t>
+            </w:r>
+            <w:r>
+              <w:rPr>
+                <w:color w:val="1F2933"/>
+                <w:sz w:val="19"/>
+                <w:szCs w:val="19"/>
+              </w:rPr>
+              <w:t xml:space="preserve"> ใช้สูตรครบ, BR-18 void แล้วออกใบใหม่ได้, เพิ่ม BR-30 (ต้องชำระครบก่อนเช็คเอาท์), บัญชีผู้ใช้หนึ่งบัญชีต่อคน, sync บทบาทพนักงาน, index ทุก FK, รายงานใช้ </w:t>
+            </w:r>
+            <w:r>
+              <w:rPr>
+                <w:rFonts w:ascii="Consolas" w:cs="Consolas" w:eastAsia="Consolas" w:hAnsi="Consolas"/>
+                <w:color w:val="3B4B5C"/>
+                <w:sz w:val="17"/>
+                <w:szCs w:val="17"/>
+              </w:rPr>
+              <w:t xml:space="preserve">app_readonly</w:t>
+            </w:r>
+            <w:r>
+              <w:rPr>
+                <w:color w:val="1F2933"/>
+                <w:sz w:val="19"/>
+                <w:szCs w:val="19"/>
+              </w:rPr>
+              <w:t xml:space="preserve"> (19 ตาราง, 7 วิว, 3 ฟังก์ชัน, 6 ทริกเกอร์)</w:t>
             </w:r>
           </w:p>
         </w:tc>
@@ -23551,7 +23707,24 @@
                 <w:sz w:val="19"/>
                 <w:szCs w:val="19"/>
               </w:rPr>
-              <w:t xml:space="preserve">; App: ตรวจล่วงหน้าเพื่อแจ้งผู้ใช้</w:t>
+              <w:t xml:space="preserve"> (เมื่อเพิ่มหรือแก้ห้องของการจอง) และ </w:t>
+            </w:r>
+            <w:r>
+              <w:rPr>
+                <w:rFonts w:ascii="Consolas" w:cs="Consolas" w:eastAsia="Consolas" w:hAnsi="Consolas"/>
+                <w:color w:val="3B4B5C"/>
+                <w:sz w:val="17"/>
+                <w:szCs w:val="17"/>
+              </w:rPr>
+              <w:t xml:space="preserve">bu_booking_no_overlap</w:t>
+            </w:r>
+            <w:r>
+              <w:rPr>
+                <w:color w:val="1F2933"/>
+                <w:sz w:val="19"/>
+                <w:szCs w:val="19"/>
+              </w:rPr>
+              <w:t xml:space="preserve"> (เมื่อแก้วันที่หรือสถานะของการจอง) ทั้งสองใช้ advisory lock ต่อห้อง การจองห้องเดียวกันพร้อมกันจึงต้องรอกันและตรวจทีละรายการ; App: lock แถวห้องและตรวจล่วงหน้าเพื่อแจ้งผู้ใช้ (409)</w:t>
             </w:r>
           </w:p>
         </w:tc>
@@ -24305,6 +24478,74 @@
                 <w:sz w:val="19"/>
                 <w:szCs w:val="19"/>
               </w:rPr>
+              <w:t xml:space="preserve"> (คอลัมน์ </w:t>
+            </w:r>
+            <w:r>
+              <w:rPr>
+                <w:rFonts w:ascii="Consolas" w:cs="Consolas" w:eastAsia="Consolas" w:hAnsi="Consolas"/>
+                <w:color w:val="3B4B5C"/>
+                <w:sz w:val="17"/>
+                <w:szCs w:val="17"/>
+              </w:rPr>
+              <w:t xml:space="preserve">paid_total</w:t>
+            </w:r>
+            <w:r>
+              <w:rPr>
+                <w:color w:val="1F2933"/>
+                <w:sz w:val="19"/>
+                <w:szCs w:val="19"/>
+              </w:rPr>
+              <w:t xml:space="preserve">, </w:t>
+            </w:r>
+            <w:r>
+              <w:rPr>
+                <w:rFonts w:ascii="Consolas" w:cs="Consolas" w:eastAsia="Consolas" w:hAnsi="Consolas"/>
+                <w:color w:val="3B4B5C"/>
+                <w:sz w:val="17"/>
+                <w:szCs w:val="17"/>
+              </w:rPr>
+              <w:t xml:space="preserve">refunded_total</w:t>
+            </w:r>
+            <w:r>
+              <w:rPr>
+                <w:color w:val="1F2933"/>
+                <w:sz w:val="19"/>
+                <w:szCs w:val="19"/>
+              </w:rPr>
+              <w:t xml:space="preserve">, </w:t>
+            </w:r>
+            <w:r>
+              <w:rPr>
+                <w:rFonts w:ascii="Consolas" w:cs="Consolas" w:eastAsia="Consolas" w:hAnsi="Consolas"/>
+                <w:color w:val="3B4B5C"/>
+                <w:sz w:val="17"/>
+                <w:szCs w:val="17"/>
+              </w:rPr>
+              <w:t xml:space="preserve">balance_due</w:t>
+            </w:r>
+            <w:r>
+              <w:rPr>
+                <w:color w:val="1F2933"/>
+                <w:sz w:val="19"/>
+                <w:szCs w:val="19"/>
+              </w:rPr>
+              <w:t xml:space="preserve"> ตามสูตรนี้ทั้งหมด) และ </w:t>
+            </w:r>
+            <w:r>
+              <w:rPr>
+                <w:rFonts w:ascii="Consolas" w:cs="Consolas" w:eastAsia="Consolas" w:hAnsi="Consolas"/>
+                <w:color w:val="3B4B5C"/>
+                <w:sz w:val="17"/>
+                <w:szCs w:val="17"/>
+              </w:rPr>
+              <w:t xml:space="preserve">v_invoice_summary</w:t>
+            </w:r>
+            <w:r>
+              <w:rPr>
+                <w:color w:val="1F2933"/>
+                <w:sz w:val="19"/>
+                <w:szCs w:val="19"/>
+              </w:rPr>
               <w:t xml:space="preserve">; App: คำนวณด้วยสูตรเดียวกัน</w:t>
             </w:r>
           </w:p>
@@ -25814,7 +26055,7 @@
                 <w:sz w:val="19"/>
                 <w:szCs w:val="19"/>
               </w:rPr>
-              <w:t xml:space="preserve"> ที่มีราคาติดลบ ยอดในใบแจ้งหนี้คงที่ ณ วันที่ออก การแก้ไขทำได้โดยยกเลิก (void) เท่านั้น</w:t>
+              <w:t xml:space="preserve"> ที่มีราคาติดลบ ยอดในใบแจ้งหนี้คงที่ ณ วันที่ออก การแก้ไขทำได้โดยยกเลิก (void) แล้วออกใบใหม่ ใบที่ void เก็บไว้เป็นหลักฐาน การจองหนึ่งรายการจึงมีใบที่ใช้งานอยู่ได้ครั้งละหนึ่งใบ ยอดแต่ละบรรทัด = จำนวน × ราคาต่อหน่วย</w:t>
             </w:r>
           </w:p>
         </w:tc>
@@ -25847,7 +26088,7 @@
                 <w:sz w:val="19"/>
                 <w:szCs w:val="19"/>
               </w:rPr>
-              <w:t xml:space="preserve">DB: UNIQUE </w:t>
+              <w:t xml:space="preserve">DB: partial unique index </w:t>
             </w:r>
             <w:r>
               <w:rPr>
@@ -25856,15 +26097,15 @@
                 <w:sz w:val="17"/>
                 <w:szCs w:val="17"/>
               </w:rPr>
-              <w:t xml:space="preserve">invoice.booking_id</w:t>
-            </w:r>
-            <w:r>
-              <w:rPr>
-                <w:color w:val="1F2933"/>
-                <w:sz w:val="19"/>
-                <w:szCs w:val="19"/>
-              </w:rPr>
-              <w:t xml:space="preserve">, </w:t>
+              <w:t xml:space="preserve">uq_invoice_active_booking</w:t>
+            </w:r>
+            <w:r>
+              <w:rPr>
+                <w:color w:val="1F2933"/>
+                <w:sz w:val="19"/>
+                <w:szCs w:val="19"/>
+              </w:rPr>
+              <w:t xml:space="preserve"> (ใบที่ไม่ void), UNIQUE </w:t>
             </w:r>
             <w:r>
               <w:rPr>
@@ -25891,6 +26132,23 @@
                 <w:szCs w:val="17"/>
               </w:rPr>
               <w:t xml:space="preserve">uq_invoice_line</w:t>
+            </w:r>
+            <w:r>
+              <w:rPr>
+                <w:color w:val="1F2933"/>
+                <w:sz w:val="19"/>
+                <w:szCs w:val="19"/>
+              </w:rPr>
+              <w:t xml:space="preserve">, CHECK </w:t>
+            </w:r>
+            <w:r>
+              <w:rPr>
+                <w:rFonts w:ascii="Consolas" w:cs="Consolas" w:eastAsia="Consolas" w:hAnsi="Consolas"/>
+                <w:color w:val="3B4B5C"/>
+                <w:sz w:val="17"/>
+                <w:szCs w:val="17"/>
+              </w:rPr>
+              <w:t xml:space="preserve">chk_invoice_line_amount</w:t>
             </w:r>
             <w:r>
               <w:rPr>
@@ -26004,6 +26262,120 @@
                 <w:szCs w:val="19"/>
               </w:rPr>
               <w:t>App</w:t>
+            </w:r>
+          </w:p>
+        </w:tc>
+      </w:tr>
+      <w:tr>
+        <w:trPr>
+          <w:cantSplit/>
+          <w:tblHeader w:val="false"/>
+        </w:trPr>
+        <w:tc>
+          <w:tcPr>
+            <w:tcW w:type="dxa" w:w="917"/>
+            <w:tcBorders>
+              <w:top w:val="single" w:color="B9C2CC" w:sz="4"/>
+              <w:left w:val="single" w:color="B9C2CC" w:sz="4"/>
+              <w:bottom w:val="single" w:color="B9C2CC" w:sz="4"/>
+              <w:right w:val="single" w:color="B9C2CC" w:sz="4"/>
+            </w:tcBorders>
+            <w:tcMar>
+              <w:top w:type="dxa" w:w="60"/>
+              <w:left w:type="dxa" w:w="100"/>
+              <w:bottom w:type="dxa" w:w="60"/>
+              <w:right w:type="dxa" w:w="100"/>
+            </w:tcMar>
+            <w:vAlign w:val="center"/>
+          </w:tcPr>
+          <w:p>
+            <w:pPr>
+              <w:keepNext w:val="false"/>
+              <w:spacing w:after="0" w:line="276"/>
+              <w:jc w:val="left"/>
+            </w:pPr>
+            <w:r>
+              <w:rPr>
+                <w:color w:val="1F2933"/>
+                <w:sz w:val="19"/>
+                <w:szCs w:val="19"/>
+              </w:rPr>
+              <w:t xml:space="preserve">BR-30</w:t>
+            </w:r>
+          </w:p>
+        </w:tc>
+        <w:tc>
+          <w:tcPr>
+            <w:tcW w:type="dxa" w:w="4055"/>
+            <w:tcBorders>
+              <w:top w:val="single" w:color="B9C2CC" w:sz="4"/>
+              <w:left w:val="single" w:color="B9C2CC" w:sz="4"/>
+              <w:bottom w:val="single" w:color="B9C2CC" w:sz="4"/>
+              <w:right w:val="single" w:color="B9C2CC" w:sz="4"/>
+            </w:tcBorders>
+            <w:tcMar>
+              <w:top w:type="dxa" w:w="60"/>
+              <w:left w:type="dxa" w:w="100"/>
+              <w:bottom w:type="dxa" w:w="60"/>
+              <w:right w:type="dxa" w:w="100"/>
+            </w:tcMar>
+            <w:vAlign w:val="center"/>
+          </w:tcPr>
+          <w:p>
+            <w:pPr>
+              <w:keepNext w:val="false"/>
+              <w:spacing w:after="0" w:line="276"/>
+              <w:jc w:val="left"/>
+            </w:pPr>
+            <w:r>
+              <w:rPr>
+                <w:color w:val="1F2933"/>
+                <w:sz w:val="19"/>
+                <w:szCs w:val="19"/>
+              </w:rPr>
+              <w:t xml:space="preserve">เช็คเอาท์ได้เมื่อยอดคงค้างของการจองเป็นศูนย์เท่านั้น แขกต้องชำระค่าห้องและค่าบริการเสริมทั้งหมดก่อนออกจากโรงแรม</w:t>
+            </w:r>
+          </w:p>
+        </w:tc>
+        <w:tc>
+          <w:tcPr>
+            <w:tcW w:type="dxa" w:w="4054"/>
+            <w:tcBorders>
+              <w:top w:val="single" w:color="B9C2CC" w:sz="4"/>
+              <w:left w:val="single" w:color="B9C2CC" w:sz="4"/>
+              <w:bottom w:val="single" w:color="B9C2CC" w:sz="4"/>
+              <w:right w:val="single" w:color="B9C2CC" w:sz="4"/>
+            </w:tcBorders>
+            <w:tcMar>
+              <w:top w:type="dxa" w:w="60"/>
+              <w:left w:type="dxa" w:w="100"/>
+              <w:bottom w:type="dxa" w:w="60"/>
+              <w:right w:type="dxa" w:w="100"/>
+            </w:tcMar>
+            <w:vAlign w:val="center"/>
+          </w:tcPr>
+          <w:p>
+            <w:pPr>
+              <w:keepNext w:val="false"/>
+              <w:spacing w:after="0" w:line="276"/>
+              <w:jc w:val="left"/>
+            </w:pPr>
+            <w:r>
+              <w:rPr>
+                <w:color w:val="1F2933"/>
+                <w:sz w:val="19"/>
+                <w:szCs w:val="19"/>
+              </w:rPr>
+              <w:t xml:space="preserve">App: ตรวจยอดคงค้าง (สูตร BR-9) ก่อนเปลี่ยนสถานะเป็น </w:t>
+            </w:r>
+            <w:r>
+              <w:rPr>
+                <w:rFonts w:ascii="Consolas" w:cs="Consolas" w:eastAsia="Consolas" w:hAnsi="Consolas"/>
+                <w:color w:val="3B4B5C"/>
+                <w:sz w:val="17"/>
+                <w:szCs w:val="17"/>
+              </w:rPr>
+              <w:t xml:space="preserve">checked_out</w:t>
             </w:r>
           </w:p>
         </w:tc>
@@ -29612,6 +29984,40 @@
                 <w:sz w:val="16"/>
                 <w:szCs w:val="16"/>
               </w:rPr>
+              <w:t xml:space="preserve">, </w:t>
+            </w:r>
+            <w:r>
+              <w:rPr>
+                <w:rFonts w:ascii="Consolas" w:cs="Consolas" w:eastAsia="Consolas" w:hAnsi="Consolas"/>
+                <w:color w:val="3B4B5C"/>
+                <w:sz w:val="14"/>
+                <w:szCs w:val="14"/>
+              </w:rPr>
+              <w:t xml:space="preserve">customer_id</w:t>
+            </w:r>
+            <w:r>
+              <w:rPr>
+                <w:color w:val="1F2933"/>
+                <w:sz w:val="16"/>
+                <w:szCs w:val="16"/>
+              </w:rPr>
+              <w:t xml:space="preserve">, </w:t>
+            </w:r>
+            <w:r>
+              <w:rPr>
+                <w:rFonts w:ascii="Consolas" w:cs="Consolas" w:eastAsia="Consolas" w:hAnsi="Consolas"/>
+                <w:color w:val="3B4B5C"/>
+                <w:sz w:val="14"/>
+                <w:szCs w:val="14"/>
+              </w:rPr>
+              <w:t xml:space="preserve">staff_id</w:t>
+            </w:r>
+            <w:r>
+              <w:rPr>
+                <w:color w:val="1F2933"/>
+                <w:sz w:val="16"/>
+                <w:szCs w:val="16"/>
+              </w:rPr>
               <w:t xml:space="preserve">; บทบาท 6 ค่า; </w:t>
             </w:r>
             <w:r>
@@ -31656,7 +32062,7 @@
                 <w:sz w:val="14"/>
                 <w:szCs w:val="14"/>
               </w:rPr>
-              <w:t xml:space="preserve">booking_id</w:t>
+              <w:t xml:space="preserve">invoice_no</w:t>
             </w:r>
             <w:r>
               <w:rPr>
@@ -31664,7 +32070,7 @@
                 <w:sz w:val="16"/>
                 <w:szCs w:val="16"/>
               </w:rPr>
-              <w:t xml:space="preserve">, </w:t>
+              <w:t xml:space="preserve">; </w:t>
             </w:r>
             <w:r>
               <w:rPr>
@@ -31673,7 +32079,7 @@
                 <w:sz w:val="14"/>
                 <w:szCs w:val="14"/>
               </w:rPr>
-              <w:t xml:space="preserve">invoice_no</w:t>
+              <w:t xml:space="preserve">uq_invoice_active_booking</w:t>
             </w:r>
             <w:r>
               <w:rPr>
@@ -31681,7 +32087,24 @@
                 <w:sz w:val="16"/>
                 <w:szCs w:val="16"/>
               </w:rPr>
-              <w:t xml:space="preserve">; สถานะ 4 ค่า; อัตราภาษี 0 ถึงน้อยกว่า 1</w:t>
+              <w:t xml:space="preserve"> (</w:t>
+            </w:r>
+            <w:r>
+              <w:rPr>
+                <w:rFonts w:ascii="Consolas" w:cs="Consolas" w:eastAsia="Consolas" w:hAnsi="Consolas"/>
+                <w:color w:val="3B4B5C"/>
+                <w:sz w:val="14"/>
+                <w:szCs w:val="14"/>
+              </w:rPr>
+              <w:t xml:space="preserve">booking_id</w:t>
+            </w:r>
+            <w:r>
+              <w:rPr>
+                <w:color w:val="1F2933"/>
+                <w:sz w:val="16"/>
+                <w:szCs w:val="16"/>
+              </w:rPr>
+              <w:t xml:space="preserve"> ไม่ซ้ำเฉพาะใบที่ไม่ void); สถานะ 4 ค่า; อัตราภาษี 0 ถึงน้อยกว่า 1</w:t>
             </w:r>
           </w:p>
         </w:tc>
@@ -32620,7 +33043,12 @@
         <w:spacing w:after="120" w:line="300"/>
       </w:pPr>
       <w:r>
-        <w:t xml:space="preserve">สรุปข้อจำกัดในฐานข้อมูล: PRIMARY KEY 19 รายการ, FOREIGN KEY 25 รายการ, UNIQUE 13 รายการ, CHECK 39 รายการ และดัชนีเสริม 18 รายการ</w:t>
+        <w:rPr>
+          <w:color w:val="1F2933"/>
+          <w:sz w:val="19"/>
+          <w:szCs w:val="19"/>
+        </w:rPr>
+        <w:t xml:space="preserve">สรุปข้อจำกัดในฐานข้อมูล: PRIMARY KEY 19 รายการ, FOREIGN KEY 25 รายการ, UNIQUE 14 รายการ, CHECK 40 รายการ และดัชนีเสริม 28 รายการ</w:t>
       </w:r>
     </w:p>
     <w:p>
@@ -33866,7 +34294,7 @@
                 <w:sz w:val="19"/>
                 <w:szCs w:val="19"/>
               </w:rPr>
-              <w:t xml:space="preserve">1 : 0..1</w:t>
+              <w:t xml:space="preserve">1 : N (ใช้งานได้ 1)</w:t>
             </w:r>
           </w:p>
         </w:tc>
@@ -33899,7 +34327,7 @@
                 <w:sz w:val="19"/>
                 <w:szCs w:val="19"/>
               </w:rPr>
-              <w:t xml:space="preserve">ใบแจ้งหนี้ไม่เกินหนึ่งใบต่อการจอง</w:t>
+              <w:t xml:space="preserve">ใบแจ้งหนี้ที่ใช้งานอยู่ได้หนึ่งใบต่อการจอง ใบที่ void เก็บไว้เป็นประวัติ</w:t>
             </w:r>
           </w:p>
         </w:tc>
@@ -34672,7 +35100,7 @@
                 <w:sz w:val="19"/>
                 <w:szCs w:val="19"/>
               </w:rPr>
-              <w:t xml:space="preserve">1 : 0..N</w:t>
+              <w:t xml:space="preserve">1 : 0..1</w:t>
             </w:r>
           </w:p>
         </w:tc>
@@ -34705,7 +35133,41 @@
                 <w:sz w:val="19"/>
                 <w:szCs w:val="19"/>
               </w:rPr>
-              <w:t xml:space="preserve">บัญชีเข้าสู่ระบบของลูกค้าหรือพนักงาน (ระบบสร้างหนึ่งบัญชีต่อบุคคล)</w:t>
+              <w:t xml:space="preserve">บัญชีเข้าสู่ระบบของลูกค้าหรือพนักงาน หนึ่งบัญชีต่อบุคคล (UNIQUE </w:t>
+            </w:r>
+            <w:r>
+              <w:rPr>
+                <w:rFonts w:ascii="Consolas" w:cs="Consolas" w:eastAsia="Consolas" w:hAnsi="Consolas"/>
+                <w:color w:val="3B4B5C"/>
+                <w:sz w:val="17"/>
+                <w:szCs w:val="17"/>
+              </w:rPr>
+              <w:t xml:space="preserve">customer_id</w:t>
+            </w:r>
+            <w:r>
+              <w:rPr>
+                <w:color w:val="1F2933"/>
+                <w:sz w:val="19"/>
+                <w:szCs w:val="19"/>
+              </w:rPr>
+              <w:t xml:space="preserve">, </w:t>
+            </w:r>
+            <w:r>
+              <w:rPr>
+                <w:rFonts w:ascii="Consolas" w:cs="Consolas" w:eastAsia="Consolas" w:hAnsi="Consolas"/>
+                <w:color w:val="3B4B5C"/>
+                <w:sz w:val="17"/>
+                <w:szCs w:val="17"/>
+              </w:rPr>
+              <w:t xml:space="preserve">staff_id</w:t>
+            </w:r>
+            <w:r>
+              <w:rPr>
+                <w:color w:val="1F2933"/>
+                <w:sz w:val="19"/>
+                <w:szCs w:val="19"/>
+              </w:rPr>
+              <w:t xml:space="preserve">)</w:t>
             </w:r>
           </w:p>
         </w:tc>
@@ -40981,7 +41443,7 @@
         <w:pStyle w:val="Heading2"/>
       </w:pPr>
       <w:r>
-        <w:t xml:space="preserve">8.3 ทริกเกอร์ (3 ทริกเกอร์)</w:t>
+        <w:t xml:space="preserve">8.3 ทริกเกอร์ (6 ทริกเกอร์)</w:t>
       </w:r>
     </w:p>
     <w:tbl>
@@ -41297,7 +41759,7 @@
                 <w:sz w:val="19"/>
                 <w:szCs w:val="19"/>
               </w:rPr>
-              <w:t xml:space="preserve">BR-5</w:t>
+              <w:t xml:space="preserve">BR-5 (advisory lock ต่อห้อง กันการจองพร้อมกัน)</w:t>
             </w:r>
           </w:p>
         </w:tc>
@@ -41337,7 +41799,7 @@
                 <w:sz w:val="17"/>
                 <w:szCs w:val="17"/>
               </w:rPr>
-              <w:t xml:space="preserve">au_booking_checkout_housekeeping</w:t>
+              <w:t xml:space="preserve">bu_booking_no_overlap</w:t>
             </w:r>
           </w:p>
         </w:tc>
@@ -41370,7 +41832,7 @@
                 <w:sz w:val="19"/>
                 <w:szCs w:val="19"/>
               </w:rPr>
-              <w:t xml:space="preserve">AFTER UPDATE OF </w:t>
+              <w:t xml:space="preserve">BEFORE UPDATE OF </w:t>
             </w:r>
             <w:r>
               <w:rPr>
@@ -41379,15 +41841,15 @@
                 <w:sz w:val="17"/>
                 <w:szCs w:val="17"/>
               </w:rPr>
-              <w:t xml:space="preserve">status</w:t>
-            </w:r>
-            <w:r>
-              <w:rPr>
-                <w:color w:val="1F2933"/>
-                <w:sz w:val="19"/>
-                <w:szCs w:val="19"/>
-              </w:rPr>
-              <w:t xml:space="preserve"> ON </w:t>
+              <w:t xml:space="preserve">check_in_date</w:t>
+            </w:r>
+            <w:r>
+              <w:rPr>
+                <w:color w:val="1F2933"/>
+                <w:sz w:val="19"/>
+                <w:szCs w:val="19"/>
+              </w:rPr>
+              <w:t xml:space="preserve">, </w:t>
             </w:r>
             <w:r>
               <w:rPr>
@@ -41396,33 +41858,16 @@
                 <w:sz w:val="17"/>
                 <w:szCs w:val="17"/>
               </w:rPr>
-              <w:t xml:space="preserve">booking</w:t>
-            </w:r>
-          </w:p>
-        </w:tc>
-        <w:tc>
-          <w:tcPr>
-            <w:tcW w:type="dxa" w:w="2275"/>
-            <w:tcBorders>
-              <w:top w:val="single" w:color="B9C2CC" w:sz="4"/>
-              <w:left w:val="single" w:color="B9C2CC" w:sz="4"/>
-              <w:bottom w:val="single" w:color="B9C2CC" w:sz="4"/>
-              <w:right w:val="single" w:color="B9C2CC" w:sz="4"/>
-            </w:tcBorders>
-            <w:tcMar>
-              <w:top w:type="dxa" w:w="60"/>
-              <w:left w:type="dxa" w:w="100"/>
-              <w:bottom w:type="dxa" w:w="60"/>
-              <w:right w:type="dxa" w:w="100"/>
-            </w:tcMar>
-            <w:vAlign w:val="center"/>
-          </w:tcPr>
-          <w:p>
-            <w:pPr>
-              <w:keepNext/>
-              <w:spacing w:after="0" w:line="276"/>
-              <w:jc w:val="left"/>
-            </w:pPr>
+              <w:t xml:space="preserve">check_out_date</w:t>
+            </w:r>
+            <w:r>
+              <w:rPr>
+                <w:color w:val="1F2933"/>
+                <w:sz w:val="19"/>
+                <w:szCs w:val="19"/>
+              </w:rPr>
+              <w:t xml:space="preserve">, </w:t>
+            </w:r>
             <w:r>
               <w:rPr>
                 <w:rFonts w:ascii="Consolas" w:cs="Consolas" w:eastAsia="Consolas" w:hAnsi="Consolas"/>
@@ -41430,7 +41875,58 @@
                 <w:sz w:val="17"/>
                 <w:szCs w:val="17"/>
               </w:rPr>
-              <w:t xml:space="preserve">trg_checkout_makes_housekeeping()</w:t>
+              <w:t xml:space="preserve">status</w:t>
+            </w:r>
+            <w:r>
+              <w:rPr>
+                <w:color w:val="1F2933"/>
+                <w:sz w:val="19"/>
+                <w:szCs w:val="19"/>
+              </w:rPr>
+              <w:t xml:space="preserve"> ON </w:t>
+            </w:r>
+            <w:r>
+              <w:rPr>
+                <w:rFonts w:ascii="Consolas" w:cs="Consolas" w:eastAsia="Consolas" w:hAnsi="Consolas"/>
+                <w:color w:val="3B4B5C"/>
+                <w:sz w:val="17"/>
+                <w:szCs w:val="17"/>
+              </w:rPr>
+              <w:t xml:space="preserve">booking</w:t>
+            </w:r>
+          </w:p>
+        </w:tc>
+        <w:tc>
+          <w:tcPr>
+            <w:tcW w:type="dxa" w:w="2275"/>
+            <w:tcBorders>
+              <w:top w:val="single" w:color="B9C2CC" w:sz="4"/>
+              <w:left w:val="single" w:color="B9C2CC" w:sz="4"/>
+              <w:bottom w:val="single" w:color="B9C2CC" w:sz="4"/>
+              <w:right w:val="single" w:color="B9C2CC" w:sz="4"/>
+            </w:tcBorders>
+            <w:tcMar>
+              <w:top w:type="dxa" w:w="60"/>
+              <w:left w:type="dxa" w:w="100"/>
+              <w:bottom w:type="dxa" w:w="60"/>
+              <w:right w:type="dxa" w:w="100"/>
+            </w:tcMar>
+            <w:vAlign w:val="center"/>
+          </w:tcPr>
+          <w:p>
+            <w:pPr>
+              <w:keepNext/>
+              <w:spacing w:after="0" w:line="276"/>
+              <w:jc w:val="left"/>
+            </w:pPr>
+            <w:r>
+              <w:rPr>
+                <w:rFonts w:ascii="Consolas" w:cs="Consolas" w:eastAsia="Consolas" w:hAnsi="Consolas"/>
+                <w:color w:val="3B4B5C"/>
+                <w:sz w:val="17"/>
+                <w:szCs w:val="17"/>
+              </w:rPr>
+              <w:t xml:space="preserve">trg_check_booking_overlap()</w:t>
             </w:r>
           </w:p>
         </w:tc>
@@ -41463,7 +41959,7 @@
                 <w:sz w:val="19"/>
                 <w:szCs w:val="19"/>
               </w:rPr>
-              <w:t xml:space="preserve">BR-20</w:t>
+              <w:t xml:space="preserve">BR-5 เมื่อเลื่อนวันหรือเปิดการจองที่ยกเลิกแล้วกลับมาใช้</w:t>
             </w:r>
           </w:p>
         </w:tc>
@@ -41492,7 +41988,7 @@
           </w:tcPr>
           <w:p>
             <w:pPr>
-              <w:keepNext w:val="false"/>
+              <w:keepNext/>
               <w:spacing w:after="0" w:line="276"/>
               <w:jc w:val="left"/>
             </w:pPr>
@@ -41503,7 +41999,7 @@
                 <w:sz w:val="17"/>
                 <w:szCs w:val="17"/>
               </w:rPr>
-              <w:t xml:space="preserve">aiu_booking_audit</w:t>
+              <w:t xml:space="preserve">au_booking_checkout_housekeeping</w:t>
             </w:r>
           </w:p>
         </w:tc>
@@ -41526,17 +42022,17 @@
           </w:tcPr>
           <w:p>
             <w:pPr>
-              <w:keepNext w:val="false"/>
-              <w:spacing w:after="0" w:line="276"/>
-              <w:jc w:val="left"/>
-            </w:pPr>
-            <w:r>
-              <w:rPr>
-                <w:color w:val="1F2933"/>
-                <w:sz w:val="19"/>
-                <w:szCs w:val="19"/>
-              </w:rPr>
-              <w:t xml:space="preserve">AFTER INSERT OR UPDATE OF </w:t>
+              <w:keepNext/>
+              <w:spacing w:after="0" w:line="276"/>
+              <w:jc w:val="left"/>
+            </w:pPr>
+            <w:r>
+              <w:rPr>
+                <w:color w:val="1F2933"/>
+                <w:sz w:val="19"/>
+                <w:szCs w:val="19"/>
+              </w:rPr>
+              <w:t xml:space="preserve">AFTER UPDATE OF </w:t>
             </w:r>
             <w:r>
               <w:rPr>
@@ -41585,7 +42081,7 @@
           </w:tcPr>
           <w:p>
             <w:pPr>
-              <w:keepNext w:val="false"/>
+              <w:keepNext/>
               <w:spacing w:after="0" w:line="276"/>
               <w:jc w:val="left"/>
             </w:pPr>
@@ -41596,7 +42092,7 @@
                 <w:sz w:val="17"/>
                 <w:szCs w:val="17"/>
               </w:rPr>
-              <w:t xml:space="preserve">trg_audit_booking()</w:t>
+              <w:t xml:space="preserve">trg_checkout_makes_housekeeping()</w:t>
             </w:r>
           </w:p>
         </w:tc>
@@ -41619,18 +42115,49 @@
           </w:tcPr>
           <w:p>
             <w:pPr>
-              <w:keepNext w:val="false"/>
-              <w:spacing w:after="0" w:line="276"/>
-              <w:jc w:val="left"/>
-            </w:pPr>
-            <w:r>
-              <w:rPr>
-                <w:color w:val="1F2933"/>
-                <w:sz w:val="19"/>
-                <w:szCs w:val="19"/>
-              </w:rPr>
-              <w:t xml:space="preserve">BR-27 (ผู้กระทำอ่านจากค่า </w:t>
-            </w:r>
+              <w:keepNext/>
+              <w:spacing w:after="0" w:line="276"/>
+              <w:jc w:val="left"/>
+            </w:pPr>
+            <w:r>
+              <w:rPr>
+                <w:color w:val="1F2933"/>
+                <w:sz w:val="19"/>
+                <w:szCs w:val="19"/>
+              </w:rPr>
+              <w:t xml:space="preserve">BR-20</w:t>
+            </w:r>
+          </w:p>
+        </w:tc>
+      </w:tr>
+      <w:tr>
+        <w:trPr>
+          <w:cantSplit/>
+          <w:tblHeader w:val="false"/>
+        </w:trPr>
+        <w:tc>
+          <w:tcPr>
+            <w:tcW w:type="dxa" w:w="2267"/>
+            <w:tcBorders>
+              <w:top w:val="single" w:color="B9C2CC" w:sz="4"/>
+              <w:left w:val="single" w:color="B9C2CC" w:sz="4"/>
+              <w:bottom w:val="single" w:color="B9C2CC" w:sz="4"/>
+              <w:right w:val="single" w:color="B9C2CC" w:sz="4"/>
+            </w:tcBorders>
+            <w:tcMar>
+              <w:top w:type="dxa" w:w="60"/>
+              <w:left w:type="dxa" w:w="100"/>
+              <w:bottom w:type="dxa" w:w="60"/>
+              <w:right w:type="dxa" w:w="100"/>
+            </w:tcMar>
+            <w:vAlign w:val="center"/>
+          </w:tcPr>
+          <w:p>
+            <w:pPr>
+              <w:keepNext/>
+              <w:spacing w:after="0" w:line="276"/>
+              <w:jc w:val="left"/>
+            </w:pPr>
             <w:r>
               <w:rPr>
                 <w:rFonts w:ascii="Consolas" w:cs="Consolas" w:eastAsia="Consolas" w:hAnsi="Consolas"/>
@@ -41638,6 +42165,141 @@
                 <w:sz w:val="17"/>
                 <w:szCs w:val="17"/>
               </w:rPr>
+              <w:t xml:space="preserve">aiu_booking_audit</w:t>
+            </w:r>
+          </w:p>
+        </w:tc>
+        <w:tc>
+          <w:tcPr>
+            <w:tcW w:type="dxa" w:w="1995"/>
+            <w:tcBorders>
+              <w:top w:val="single" w:color="B9C2CC" w:sz="4"/>
+              <w:left w:val="single" w:color="B9C2CC" w:sz="4"/>
+              <w:bottom w:val="single" w:color="B9C2CC" w:sz="4"/>
+              <w:right w:val="single" w:color="B9C2CC" w:sz="4"/>
+            </w:tcBorders>
+            <w:tcMar>
+              <w:top w:type="dxa" w:w="60"/>
+              <w:left w:type="dxa" w:w="100"/>
+              <w:bottom w:type="dxa" w:w="60"/>
+              <w:right w:type="dxa" w:w="100"/>
+            </w:tcMar>
+            <w:vAlign w:val="center"/>
+          </w:tcPr>
+          <w:p>
+            <w:pPr>
+              <w:keepNext/>
+              <w:spacing w:after="0" w:line="276"/>
+              <w:jc w:val="left"/>
+            </w:pPr>
+            <w:r>
+              <w:rPr>
+                <w:color w:val="1F2933"/>
+                <w:sz w:val="19"/>
+                <w:szCs w:val="19"/>
+              </w:rPr>
+              <w:t xml:space="preserve">AFTER INSERT OR UPDATE OF </w:t>
+            </w:r>
+            <w:r>
+              <w:rPr>
+                <w:rFonts w:ascii="Consolas" w:cs="Consolas" w:eastAsia="Consolas" w:hAnsi="Consolas"/>
+                <w:color w:val="3B4B5C"/>
+                <w:sz w:val="17"/>
+                <w:szCs w:val="17"/>
+              </w:rPr>
+              <w:t xml:space="preserve">status</w:t>
+            </w:r>
+            <w:r>
+              <w:rPr>
+                <w:color w:val="1F2933"/>
+                <w:sz w:val="19"/>
+                <w:szCs w:val="19"/>
+              </w:rPr>
+              <w:t xml:space="preserve"> ON </w:t>
+            </w:r>
+            <w:r>
+              <w:rPr>
+                <w:rFonts w:ascii="Consolas" w:cs="Consolas" w:eastAsia="Consolas" w:hAnsi="Consolas"/>
+                <w:color w:val="3B4B5C"/>
+                <w:sz w:val="17"/>
+                <w:szCs w:val="17"/>
+              </w:rPr>
+              <w:t xml:space="preserve">booking</w:t>
+            </w:r>
+          </w:p>
+        </w:tc>
+        <w:tc>
+          <w:tcPr>
+            <w:tcW w:type="dxa" w:w="2275"/>
+            <w:tcBorders>
+              <w:top w:val="single" w:color="B9C2CC" w:sz="4"/>
+              <w:left w:val="single" w:color="B9C2CC" w:sz="4"/>
+              <w:bottom w:val="single" w:color="B9C2CC" w:sz="4"/>
+              <w:right w:val="single" w:color="B9C2CC" w:sz="4"/>
+            </w:tcBorders>
+            <w:tcMar>
+              <w:top w:type="dxa" w:w="60"/>
+              <w:left w:type="dxa" w:w="100"/>
+              <w:bottom w:type="dxa" w:w="60"/>
+              <w:right w:type="dxa" w:w="100"/>
+            </w:tcMar>
+            <w:vAlign w:val="center"/>
+          </w:tcPr>
+          <w:p>
+            <w:pPr>
+              <w:keepNext/>
+              <w:spacing w:after="0" w:line="276"/>
+              <w:jc w:val="left"/>
+            </w:pPr>
+            <w:r>
+              <w:rPr>
+                <w:rFonts w:ascii="Consolas" w:cs="Consolas" w:eastAsia="Consolas" w:hAnsi="Consolas"/>
+                <w:color w:val="3B4B5C"/>
+                <w:sz w:val="17"/>
+                <w:szCs w:val="17"/>
+              </w:rPr>
+              <w:t xml:space="preserve">trg_audit_booking()</w:t>
+            </w:r>
+          </w:p>
+        </w:tc>
+        <w:tc>
+          <w:tcPr>
+            <w:tcW w:type="dxa" w:w="2489"/>
+            <w:tcBorders>
+              <w:top w:val="single" w:color="B9C2CC" w:sz="4"/>
+              <w:left w:val="single" w:color="B9C2CC" w:sz="4"/>
+              <w:bottom w:val="single" w:color="B9C2CC" w:sz="4"/>
+              <w:right w:val="single" w:color="B9C2CC" w:sz="4"/>
+            </w:tcBorders>
+            <w:tcMar>
+              <w:top w:type="dxa" w:w="60"/>
+              <w:left w:type="dxa" w:w="100"/>
+              <w:bottom w:type="dxa" w:w="60"/>
+              <w:right w:type="dxa" w:w="100"/>
+            </w:tcMar>
+            <w:vAlign w:val="center"/>
+          </w:tcPr>
+          <w:p>
+            <w:pPr>
+              <w:keepNext/>
+              <w:spacing w:after="0" w:line="276"/>
+              <w:jc w:val="left"/>
+            </w:pPr>
+            <w:r>
+              <w:rPr>
+                <w:color w:val="1F2933"/>
+                <w:sz w:val="19"/>
+                <w:szCs w:val="19"/>
+              </w:rPr>
+              <w:t xml:space="preserve">BR-27 (ผู้กระทำอ่านจากค่า </w:t>
+            </w:r>
+            <w:r>
+              <w:rPr>
+                <w:rFonts w:ascii="Consolas" w:cs="Consolas" w:eastAsia="Consolas" w:hAnsi="Consolas"/>
+                <w:color w:val="3B4B5C"/>
+                <w:sz w:val="17"/>
+                <w:szCs w:val="17"/>
+              </w:rPr>
               <w:t xml:space="preserve">app.actor</w:t>
             </w:r>
             <w:r>
@@ -41647,6 +42309,389 @@
                 <w:szCs w:val="19"/>
               </w:rPr>
               <w:t xml:space="preserve"> ที่แอปพลิเคชันตั้งให้ต่อธุรกรรม)</w:t>
+            </w:r>
+          </w:p>
+        </w:tc>
+      </w:tr>
+      <w:tr>
+        <w:trPr>
+          <w:cantSplit/>
+          <w:tblHeader w:val="false"/>
+        </w:trPr>
+        <w:tc>
+          <w:tcPr>
+            <w:tcW w:type="dxa" w:w="2267"/>
+            <w:tcBorders>
+              <w:top w:val="single" w:color="B9C2CC" w:sz="4"/>
+              <w:left w:val="single" w:color="B9C2CC" w:sz="4"/>
+              <w:bottom w:val="single" w:color="B9C2CC" w:sz="4"/>
+              <w:right w:val="single" w:color="B9C2CC" w:sz="4"/>
+            </w:tcBorders>
+            <w:tcMar>
+              <w:top w:type="dxa" w:w="60"/>
+              <w:left w:type="dxa" w:w="100"/>
+              <w:bottom w:type="dxa" w:w="60"/>
+              <w:right w:type="dxa" w:w="100"/>
+            </w:tcMar>
+            <w:vAlign w:val="center"/>
+          </w:tcPr>
+          <w:p>
+            <w:pPr>
+              <w:keepNext/>
+              <w:spacing w:after="0" w:line="276"/>
+              <w:jc w:val="left"/>
+            </w:pPr>
+            <w:r>
+              <w:rPr>
+                <w:rFonts w:ascii="Consolas" w:cs="Consolas" w:eastAsia="Consolas" w:hAnsi="Consolas"/>
+                <w:color w:val="3B4B5C"/>
+                <w:sz w:val="17"/>
+                <w:szCs w:val="17"/>
+              </w:rPr>
+              <w:t xml:space="preserve">aiu_app_user_role_sync</w:t>
+            </w:r>
+          </w:p>
+        </w:tc>
+        <w:tc>
+          <w:tcPr>
+            <w:tcW w:type="dxa" w:w="1995"/>
+            <w:tcBorders>
+              <w:top w:val="single" w:color="B9C2CC" w:sz="4"/>
+              <w:left w:val="single" w:color="B9C2CC" w:sz="4"/>
+              <w:bottom w:val="single" w:color="B9C2CC" w:sz="4"/>
+              <w:right w:val="single" w:color="B9C2CC" w:sz="4"/>
+            </w:tcBorders>
+            <w:tcMar>
+              <w:top w:type="dxa" w:w="60"/>
+              <w:left w:type="dxa" w:w="100"/>
+              <w:bottom w:type="dxa" w:w="60"/>
+              <w:right w:type="dxa" w:w="100"/>
+            </w:tcMar>
+            <w:vAlign w:val="center"/>
+          </w:tcPr>
+          <w:p>
+            <w:pPr>
+              <w:keepNext/>
+              <w:spacing w:after="0" w:line="276"/>
+              <w:jc w:val="left"/>
+            </w:pPr>
+            <w:r>
+              <w:rPr>
+                <w:color w:val="1F2933"/>
+                <w:sz w:val="19"/>
+                <w:szCs w:val="19"/>
+              </w:rPr>
+              <w:t xml:space="preserve">AFTER INSERT OR UPDATE OF </w:t>
+            </w:r>
+            <w:r>
+              <w:rPr>
+                <w:rFonts w:ascii="Consolas" w:cs="Consolas" w:eastAsia="Consolas" w:hAnsi="Consolas"/>
+                <w:color w:val="3B4B5C"/>
+                <w:sz w:val="17"/>
+                <w:szCs w:val="17"/>
+              </w:rPr>
+              <w:t xml:space="preserve">role</w:t>
+            </w:r>
+            <w:r>
+              <w:rPr>
+                <w:color w:val="1F2933"/>
+                <w:sz w:val="19"/>
+                <w:szCs w:val="19"/>
+              </w:rPr>
+              <w:t xml:space="preserve">, </w:t>
+            </w:r>
+            <w:r>
+              <w:rPr>
+                <w:rFonts w:ascii="Consolas" w:cs="Consolas" w:eastAsia="Consolas" w:hAnsi="Consolas"/>
+                <w:color w:val="3B4B5C"/>
+                <w:sz w:val="17"/>
+                <w:szCs w:val="17"/>
+              </w:rPr>
+              <w:t xml:space="preserve">staff_id</w:t>
+            </w:r>
+            <w:r>
+              <w:rPr>
+                <w:color w:val="1F2933"/>
+                <w:sz w:val="19"/>
+                <w:szCs w:val="19"/>
+              </w:rPr>
+              <w:t xml:space="preserve"> ON </w:t>
+            </w:r>
+            <w:r>
+              <w:rPr>
+                <w:rFonts w:ascii="Consolas" w:cs="Consolas" w:eastAsia="Consolas" w:hAnsi="Consolas"/>
+                <w:color w:val="3B4B5C"/>
+                <w:sz w:val="17"/>
+                <w:szCs w:val="17"/>
+              </w:rPr>
+              <w:t xml:space="preserve">app_user</w:t>
+            </w:r>
+          </w:p>
+        </w:tc>
+        <w:tc>
+          <w:tcPr>
+            <w:tcW w:type="dxa" w:w="2275"/>
+            <w:tcBorders>
+              <w:top w:val="single" w:color="B9C2CC" w:sz="4"/>
+              <w:left w:val="single" w:color="B9C2CC" w:sz="4"/>
+              <w:bottom w:val="single" w:color="B9C2CC" w:sz="4"/>
+              <w:right w:val="single" w:color="B9C2CC" w:sz="4"/>
+            </w:tcBorders>
+            <w:tcMar>
+              <w:top w:type="dxa" w:w="60"/>
+              <w:left w:type="dxa" w:w="100"/>
+              <w:bottom w:type="dxa" w:w="60"/>
+              <w:right w:type="dxa" w:w="100"/>
+            </w:tcMar>
+            <w:vAlign w:val="center"/>
+          </w:tcPr>
+          <w:p>
+            <w:pPr>
+              <w:keepNext/>
+              <w:spacing w:after="0" w:line="276"/>
+              <w:jc w:val="left"/>
+            </w:pPr>
+            <w:r>
+              <w:rPr>
+                <w:rFonts w:ascii="Consolas" w:cs="Consolas" w:eastAsia="Consolas" w:hAnsi="Consolas"/>
+                <w:color w:val="3B4B5C"/>
+                <w:sz w:val="17"/>
+                <w:szCs w:val="17"/>
+              </w:rPr>
+              <w:t xml:space="preserve">trg_sync_role_from_user()</w:t>
+            </w:r>
+          </w:p>
+        </w:tc>
+        <w:tc>
+          <w:tcPr>
+            <w:tcW w:type="dxa" w:w="2489"/>
+            <w:tcBorders>
+              <w:top w:val="single" w:color="B9C2CC" w:sz="4"/>
+              <w:left w:val="single" w:color="B9C2CC" w:sz="4"/>
+              <w:bottom w:val="single" w:color="B9C2CC" w:sz="4"/>
+              <w:right w:val="single" w:color="B9C2CC" w:sz="4"/>
+            </w:tcBorders>
+            <w:tcMar>
+              <w:top w:type="dxa" w:w="60"/>
+              <w:left w:type="dxa" w:w="100"/>
+              <w:bottom w:type="dxa" w:w="60"/>
+              <w:right w:type="dxa" w:w="100"/>
+            </w:tcMar>
+            <w:vAlign w:val="center"/>
+          </w:tcPr>
+          <w:p>
+            <w:pPr>
+              <w:keepNext/>
+              <w:spacing w:after="0" w:line="276"/>
+              <w:jc w:val="left"/>
+            </w:pPr>
+            <w:r>
+              <w:rPr>
+                <w:color w:val="1F2933"/>
+                <w:sz w:val="19"/>
+                <w:szCs w:val="19"/>
+              </w:rPr>
+              <w:t xml:space="preserve">บทบาทพนักงานมีค่าเดียว (</w:t>
+            </w:r>
+            <w:r>
+              <w:rPr>
+                <w:rFonts w:ascii="Consolas" w:cs="Consolas" w:eastAsia="Consolas" w:hAnsi="Consolas"/>
+                <w:color w:val="3B4B5C"/>
+                <w:sz w:val="17"/>
+                <w:szCs w:val="17"/>
+              </w:rPr>
+              <w:t xml:space="preserve">staff.role</w:t>
+            </w:r>
+            <w:r>
+              <w:rPr>
+                <w:color w:val="1F2933"/>
+                <w:sz w:val="19"/>
+                <w:szCs w:val="19"/>
+              </w:rPr>
+              <w:t xml:space="preserve"> = </w:t>
+            </w:r>
+            <w:r>
+              <w:rPr>
+                <w:rFonts w:ascii="Consolas" w:cs="Consolas" w:eastAsia="Consolas" w:hAnsi="Consolas"/>
+                <w:color w:val="3B4B5C"/>
+                <w:sz w:val="17"/>
+                <w:szCs w:val="17"/>
+              </w:rPr>
+              <w:t xml:space="preserve">app_user.role</w:t>
+            </w:r>
+            <w:r>
+              <w:rPr>
+                <w:color w:val="1F2933"/>
+                <w:sz w:val="19"/>
+                <w:szCs w:val="19"/>
+              </w:rPr>
+              <w:t xml:space="preserve">) กัน update anomaly</w:t>
+            </w:r>
+          </w:p>
+        </w:tc>
+      </w:tr>
+      <w:tr>
+        <w:trPr>
+          <w:cantSplit/>
+          <w:tblHeader w:val="false"/>
+        </w:trPr>
+        <w:tc>
+          <w:tcPr>
+            <w:tcW w:type="dxa" w:w="2267"/>
+            <w:tcBorders>
+              <w:top w:val="single" w:color="B9C2CC" w:sz="4"/>
+              <w:left w:val="single" w:color="B9C2CC" w:sz="4"/>
+              <w:bottom w:val="single" w:color="B9C2CC" w:sz="4"/>
+              <w:right w:val="single" w:color="B9C2CC" w:sz="4"/>
+            </w:tcBorders>
+            <w:tcMar>
+              <w:top w:type="dxa" w:w="60"/>
+              <w:left w:type="dxa" w:w="100"/>
+              <w:bottom w:type="dxa" w:w="60"/>
+              <w:right w:type="dxa" w:w="100"/>
+            </w:tcMar>
+            <w:vAlign w:val="center"/>
+          </w:tcPr>
+          <w:p>
+            <w:pPr>
+              <w:keepNext/>
+              <w:spacing w:after="0" w:line="276"/>
+              <w:jc w:val="left"/>
+            </w:pPr>
+            <w:r>
+              <w:rPr>
+                <w:rFonts w:ascii="Consolas" w:cs="Consolas" w:eastAsia="Consolas" w:hAnsi="Consolas"/>
+                <w:color w:val="3B4B5C"/>
+                <w:sz w:val="17"/>
+                <w:szCs w:val="17"/>
+              </w:rPr>
+              <w:t xml:space="preserve">au_staff_role_sync</w:t>
+            </w:r>
+          </w:p>
+        </w:tc>
+        <w:tc>
+          <w:tcPr>
+            <w:tcW w:type="dxa" w:w="1995"/>
+            <w:tcBorders>
+              <w:top w:val="single" w:color="B9C2CC" w:sz="4"/>
+              <w:left w:val="single" w:color="B9C2CC" w:sz="4"/>
+              <w:bottom w:val="single" w:color="B9C2CC" w:sz="4"/>
+              <w:right w:val="single" w:color="B9C2CC" w:sz="4"/>
+            </w:tcBorders>
+            <w:tcMar>
+              <w:top w:type="dxa" w:w="60"/>
+              <w:left w:type="dxa" w:w="100"/>
+              <w:bottom w:type="dxa" w:w="60"/>
+              <w:right w:type="dxa" w:w="100"/>
+            </w:tcMar>
+            <w:vAlign w:val="center"/>
+          </w:tcPr>
+          <w:p>
+            <w:pPr>
+              <w:keepNext/>
+              <w:spacing w:after="0" w:line="276"/>
+              <w:jc w:val="left"/>
+            </w:pPr>
+            <w:r>
+              <w:rPr>
+                <w:color w:val="1F2933"/>
+                <w:sz w:val="19"/>
+                <w:szCs w:val="19"/>
+              </w:rPr>
+              <w:t xml:space="preserve">AFTER UPDATE OF </w:t>
+            </w:r>
+            <w:r>
+              <w:rPr>
+                <w:rFonts w:ascii="Consolas" w:cs="Consolas" w:eastAsia="Consolas" w:hAnsi="Consolas"/>
+                <w:color w:val="3B4B5C"/>
+                <w:sz w:val="17"/>
+                <w:szCs w:val="17"/>
+              </w:rPr>
+              <w:t xml:space="preserve">role</w:t>
+            </w:r>
+            <w:r>
+              <w:rPr>
+                <w:color w:val="1F2933"/>
+                <w:sz w:val="19"/>
+                <w:szCs w:val="19"/>
+              </w:rPr>
+              <w:t xml:space="preserve"> ON </w:t>
+            </w:r>
+            <w:r>
+              <w:rPr>
+                <w:rFonts w:ascii="Consolas" w:cs="Consolas" w:eastAsia="Consolas" w:hAnsi="Consolas"/>
+                <w:color w:val="3B4B5C"/>
+                <w:sz w:val="17"/>
+                <w:szCs w:val="17"/>
+              </w:rPr>
+              <w:t xml:space="preserve">staff</w:t>
+            </w:r>
+          </w:p>
+        </w:tc>
+        <w:tc>
+          <w:tcPr>
+            <w:tcW w:type="dxa" w:w="2275"/>
+            <w:tcBorders>
+              <w:top w:val="single" w:color="B9C2CC" w:sz="4"/>
+              <w:left w:val="single" w:color="B9C2CC" w:sz="4"/>
+              <w:bottom w:val="single" w:color="B9C2CC" w:sz="4"/>
+              <w:right w:val="single" w:color="B9C2CC" w:sz="4"/>
+            </w:tcBorders>
+            <w:tcMar>
+              <w:top w:type="dxa" w:w="60"/>
+              <w:left w:type="dxa" w:w="100"/>
+              <w:bottom w:type="dxa" w:w="60"/>
+              <w:right w:type="dxa" w:w="100"/>
+            </w:tcMar>
+            <w:vAlign w:val="center"/>
+          </w:tcPr>
+          <w:p>
+            <w:pPr>
+              <w:keepNext/>
+              <w:spacing w:after="0" w:line="276"/>
+              <w:jc w:val="left"/>
+            </w:pPr>
+            <w:r>
+              <w:rPr>
+                <w:rFonts w:ascii="Consolas" w:cs="Consolas" w:eastAsia="Consolas" w:hAnsi="Consolas"/>
+                <w:color w:val="3B4B5C"/>
+                <w:sz w:val="17"/>
+                <w:szCs w:val="17"/>
+              </w:rPr>
+              <w:t xml:space="preserve">trg_sync_role_from_staff()</w:t>
+            </w:r>
+          </w:p>
+        </w:tc>
+        <w:tc>
+          <w:tcPr>
+            <w:tcW w:type="dxa" w:w="2489"/>
+            <w:tcBorders>
+              <w:top w:val="single" w:color="B9C2CC" w:sz="4"/>
+              <w:left w:val="single" w:color="B9C2CC" w:sz="4"/>
+              <w:bottom w:val="single" w:color="B9C2CC" w:sz="4"/>
+              <w:right w:val="single" w:color="B9C2CC" w:sz="4"/>
+            </w:tcBorders>
+            <w:tcMar>
+              <w:top w:type="dxa" w:w="60"/>
+              <w:left w:type="dxa" w:w="100"/>
+              <w:bottom w:type="dxa" w:w="60"/>
+              <w:right w:type="dxa" w:w="100"/>
+            </w:tcMar>
+            <w:vAlign w:val="center"/>
+          </w:tcPr>
+          <w:p>
+            <w:pPr>
+              <w:keepNext/>
+              <w:spacing w:after="0" w:line="276"/>
+              <w:jc w:val="left"/>
+            </w:pPr>
+            <w:r>
+              <w:rPr>
+                <w:color w:val="1F2933"/>
+                <w:sz w:val="19"/>
+                <w:szCs w:val="19"/>
+              </w:rPr>
+              <w:t xml:space="preserve">เช่นเดียวกัน ในทิศกลับ</w:t>
             </w:r>
           </w:p>
         </w:tc>
@@ -42129,7 +43174,7 @@
                 <w:sz w:val="19"/>
                 <w:szCs w:val="19"/>
               </w:rPr>
-              <w:t xml:space="preserve"> ที่ทำได้เฉพาะ SELECT, INSERT, UPDATE, DELETE และงานรายงานใช้บทบาท </w:t>
+              <w:t xml:space="preserve"> ที่ทำได้เฉพาะ SELECT, INSERT, UPDATE, DELETE และงานรายงาน (</w:t>
             </w:r>
             <w:r>
               <w:rPr>
@@ -42138,6 +43183,23 @@
                 <w:sz w:val="17"/>
                 <w:szCs w:val="17"/>
               </w:rPr>
+              <w:t xml:space="preserve">/reports/*</w:t>
+            </w:r>
+            <w:r>
+              <w:rPr>
+                <w:color w:val="1F2933"/>
+                <w:sz w:val="19"/>
+                <w:szCs w:val="19"/>
+              </w:rPr>
+              <w:t xml:space="preserve">) เชื่อมต่อด้วยบทบาท </w:t>
+            </w:r>
+            <w:r>
+              <w:rPr>
+                <w:rFonts w:ascii="Consolas" w:cs="Consolas" w:eastAsia="Consolas" w:hAnsi="Consolas"/>
+                <w:color w:val="3B4B5C"/>
+                <w:sz w:val="17"/>
+                <w:szCs w:val="17"/>
+              </w:rPr>
               <w:t xml:space="preserve">app_readonly</w:t>
             </w:r>
             <w:r>
@@ -42146,7 +43208,24 @@
                 <w:sz w:val="19"/>
                 <w:szCs w:val="19"/>
               </w:rPr>
-              <w:t xml:space="preserve"> ที่อ่านได้อย่างเดียว ทั้งสองบทบาทสร้างหรือลบวัตถุในฐานข้อมูลไม่ได้ (</w:t>
+              <w:t xml:space="preserve"> ที่อ่านได้อย่างเดียว (ตัวแปร </w:t>
+            </w:r>
+            <w:r>
+              <w:rPr>
+                <w:rFonts w:ascii="Consolas" w:cs="Consolas" w:eastAsia="Consolas" w:hAnsi="Consolas"/>
+                <w:color w:val="3B4B5C"/>
+                <w:sz w:val="17"/>
+                <w:szCs w:val="17"/>
+              </w:rPr>
+              <w:t xml:space="preserve">DATABASE_URL_READONLY</w:t>
+            </w:r>
+            <w:r>
+              <w:rPr>
+                <w:color w:val="1F2933"/>
+                <w:sz w:val="19"/>
+                <w:szCs w:val="19"/>
+              </w:rPr>
+              <w:t xml:space="preserve">) ทั้งสองบทบาทสร้างหรือลบวัตถุในฐานข้อมูลไม่ได้ (</w:t>
             </w:r>
             <w:r>
               <w:rPr>
@@ -42478,7 +43557,7 @@
                 <w:sz w:val="19"/>
                 <w:szCs w:val="19"/>
               </w:rPr>
-              <w:t xml:space="preserve">มีดัชนีเสริม 18 รายการบนคีย์นอกและคอลัมน์ที่ค้นหาบ่อย ได้แก่ ช่วงวันเข้าพัก สถานะการจอง ห้องในการจอง การชำระเงิน แผนราคาที่เปิดใช้งาน กระดานงานแม่บ้าน งานซ่อมค้าง และเวลาของประวัติ รายการข้อมูลแบ่งหน้าได้สูงสุด 1,000 แถวต่อคำขอ</w:t>
+              <w:t xml:space="preserve">มีดัชนีเสริม 28 รายการบนคีย์นอกและคอลัมน์ที่ค้นหาบ่อย ได้แก่ ช่วงวันเข้าพัก สถานะการจอง ห้องในการจอง การชำระเงิน แผนราคาที่เปิดใช้งาน กระดานงานแม่บ้าน งานซ่อมค้าง และเวลาของประวัติ รายการข้อมูลแบ่งหน้าได้สูงสุด 1,000 แถวต่อคำขอ</w:t>
             </w:r>
           </w:p>
         </w:tc>
@@ -43119,7 +44198,12 @@
         <w:spacing w:after="80" w:line="300"/>
       </w:pPr>
       <w:r>
-        <w:t xml:space="preserve">ใบแจ้งหนี้ที่ถูกยกเลิก (void) ยังคงอยู่ในระบบ และเนื่องจากข้อจำกัด UNIQUE ของ </w:t>
+        <w:rPr>
+          <w:color w:val="1F2933"/>
+          <w:sz w:val="19"/>
+          <w:szCs w:val="19"/>
+        </w:rPr>
+        <w:t xml:space="preserve">ใบแจ้งหนี้ที่ถูกยกเลิก (void) ยังคงอยู่ในระบบเป็นหลักฐาน และการจองนั้นออกใบแจ้งหนี้ใหม่ได้ (partial unique index </w:t>
       </w:r>
       <w:r>
         <w:rPr>
@@ -43128,10 +44212,15 @@
           <w:sz w:val="19"/>
           <w:szCs w:val="19"/>
         </w:rPr>
-        <w:t xml:space="preserve">invoice.booking_id</w:t>
+        <w:t xml:space="preserve">uq_invoice_active_booking</w:t>
       </w:r>
       <w:r>
-        <w:t xml:space="preserve"> การจองนั้นออกใบแจ้งหนี้ใหม่ไม่ได้</w:t>
+        <w:rPr>
+          <w:color w:val="1F2933"/>
+          <w:sz w:val="19"/>
+          <w:szCs w:val="19"/>
+        </w:rPr>
+        <w:t xml:space="preserve"> จำกัดเฉพาะใบที่ไม่ void ให้มีได้ใบเดียว ตาม BR-18)</w:t>
       </w:r>
     </w:p>
     <w:p>
@@ -48562,7 +49651,7 @@
                 <w:sz w:val="19"/>
                 <w:szCs w:val="19"/>
               </w:rPr>
-              <w:t>ผ่าน 185 กรณีทดสอบ</w:t>
+              <w:t xml:space="preserve">ผ่าน 198 กรณีทดสอบ</w:t>
             </w:r>
           </w:p>
         </w:tc>

</xml_diff>

<commit_message>
Docs: remove approval section from BRD
</commit_message>
<xml_diff>
--- a/01-proposal/business-requirements.docx
+++ b/01-proposal/business-requirements.docx
@@ -1517,19 +1517,6 @@
       </w:pPr>
       <w:r>
         <w:t xml:space="preserve">เกณฑ์การยอมรับ (Acceptance Criteria)</w:t>
-      </w:r>
-    </w:p>
-    <w:p>
-      <w:pPr>
-        <w:pStyle w:val="ListParagraph"/>
-        <w:numPr>
-          <w:ilvl w:val="0"/>
-          <w:numId w:val="2"/>
-        </w:numPr>
-        <w:spacing w:after="80" w:line="300"/>
-      </w:pPr>
-      <w:r>
-        <w:t xml:space="preserve">การอนุมัติเอกสาร</w:t>
       </w:r>
     </w:p>
     <w:p>
@@ -49863,536 +49850,6 @@
               </w:rPr>
               <w:t xml:space="preserve">ผ่าน ไม่มีข้อผิดพลาด</w:t>
             </w:r>
-          </w:p>
-        </w:tc>
-      </w:tr>
-    </w:tbl>
-    <w:p>
-      <w:pPr>
-        <w:spacing w:after="160"/>
-      </w:pPr>
-    </w:p>
-    <w:p>
-      <w:r>
-        <w:br w:type="page"/>
-      </w:r>
-    </w:p>
-    <w:p>
-      <w:pPr>
-        <w:pStyle w:val="Heading1"/>
-      </w:pPr>
-      <w:r>
-        <w:t xml:space="preserve">13. การอนุมัติเอกสาร</w:t>
-      </w:r>
-    </w:p>
-    <w:tbl>
-      <w:tblPr>
-        <w:tblW w:type="dxa" w:w="9026"/>
-        <w:tblBorders>
-          <w:top w:val="single" w:color="auto" w:sz="4"/>
-          <w:left w:val="single" w:color="auto" w:sz="4"/>
-          <w:bottom w:val="single" w:color="auto" w:sz="4"/>
-          <w:right w:val="single" w:color="auto" w:sz="4"/>
-          <w:insideH w:val="single" w:color="auto" w:sz="4"/>
-          <w:insideV w:val="single" w:color="auto" w:sz="4"/>
-        </w:tblBorders>
-        <w:tblLayout w:type="fixed"/>
-      </w:tblPr>
-      <w:tblGrid>
-        <w:gridCol w:w="3821"/>
-        <w:gridCol w:w="2258"/>
-        <w:gridCol w:w="1413"/>
-        <w:gridCol w:w="1534"/>
-      </w:tblGrid>
-      <w:tr>
-        <w:trPr>
-          <w:cantSplit/>
-          <w:tblHeader/>
-        </w:trPr>
-        <w:tc>
-          <w:tcPr>
-            <w:tcW w:type="dxa" w:w="3821"/>
-            <w:tcBorders>
-              <w:top w:val="single" w:color="B9C2CC" w:sz="4"/>
-              <w:left w:val="single" w:color="B9C2CC" w:sz="4"/>
-              <w:bottom w:val="single" w:color="B9C2CC" w:sz="4"/>
-              <w:right w:val="single" w:color="B9C2CC" w:sz="4"/>
-            </w:tcBorders>
-            <w:shd w:fill="EFE7D8" w:color="auto" w:val="clear"/>
-            <w:tcMar>
-              <w:top w:type="dxa" w:w="60"/>
-              <w:left w:type="dxa" w:w="100"/>
-              <w:bottom w:type="dxa" w:w="60"/>
-              <w:right w:type="dxa" w:w="100"/>
-            </w:tcMar>
-            <w:vAlign w:val="center"/>
-          </w:tcPr>
-          <w:p>
-            <w:pPr>
-              <w:keepNext/>
-              <w:spacing w:after="0" w:line="276"/>
-              <w:jc w:val="left"/>
-            </w:pPr>
-            <w:r>
-              <w:rPr>
-                <w:b/>
-                <w:bCs/>
-                <w:color w:val="1F2933"/>
-                <w:sz w:val="19"/>
-                <w:szCs w:val="19"/>
-              </w:rPr>
-              <w:t xml:space="preserve">บทบาท</w:t>
-            </w:r>
-          </w:p>
-        </w:tc>
-        <w:tc>
-          <w:tcPr>
-            <w:tcW w:type="dxa" w:w="2258"/>
-            <w:tcBorders>
-              <w:top w:val="single" w:color="B9C2CC" w:sz="4"/>
-              <w:left w:val="single" w:color="B9C2CC" w:sz="4"/>
-              <w:bottom w:val="single" w:color="B9C2CC" w:sz="4"/>
-              <w:right w:val="single" w:color="B9C2CC" w:sz="4"/>
-            </w:tcBorders>
-            <w:shd w:fill="EFE7D8" w:color="auto" w:val="clear"/>
-            <w:tcMar>
-              <w:top w:type="dxa" w:w="60"/>
-              <w:left w:type="dxa" w:w="100"/>
-              <w:bottom w:type="dxa" w:w="60"/>
-              <w:right w:type="dxa" w:w="100"/>
-            </w:tcMar>
-            <w:vAlign w:val="center"/>
-          </w:tcPr>
-          <w:p>
-            <w:pPr>
-              <w:keepNext/>
-              <w:spacing w:after="0" w:line="276"/>
-              <w:jc w:val="left"/>
-            </w:pPr>
-            <w:r>
-              <w:rPr>
-                <w:b/>
-                <w:bCs/>
-                <w:color w:val="1F2933"/>
-                <w:sz w:val="19"/>
-                <w:szCs w:val="19"/>
-              </w:rPr>
-              <w:t xml:space="preserve">ชื่อ - รหัสนักศึกษา</w:t>
-            </w:r>
-          </w:p>
-        </w:tc>
-        <w:tc>
-          <w:tcPr>
-            <w:tcW w:type="dxa" w:w="1413"/>
-            <w:tcBorders>
-              <w:top w:val="single" w:color="B9C2CC" w:sz="4"/>
-              <w:left w:val="single" w:color="B9C2CC" w:sz="4"/>
-              <w:bottom w:val="single" w:color="B9C2CC" w:sz="4"/>
-              <w:right w:val="single" w:color="B9C2CC" w:sz="4"/>
-            </w:tcBorders>
-            <w:shd w:fill="EFE7D8" w:color="auto" w:val="clear"/>
-            <w:tcMar>
-              <w:top w:type="dxa" w:w="60"/>
-              <w:left w:type="dxa" w:w="100"/>
-              <w:bottom w:type="dxa" w:w="60"/>
-              <w:right w:type="dxa" w:w="100"/>
-            </w:tcMar>
-            <w:vAlign w:val="center"/>
-          </w:tcPr>
-          <w:p>
-            <w:pPr>
-              <w:keepNext/>
-              <w:spacing w:after="0" w:line="276"/>
-              <w:jc w:val="left"/>
-            </w:pPr>
-            <w:r>
-              <w:rPr>
-                <w:b/>
-                <w:bCs/>
-                <w:color w:val="1F2933"/>
-                <w:sz w:val="19"/>
-                <w:szCs w:val="19"/>
-              </w:rPr>
-              <w:t xml:space="preserve">ลงนาม</w:t>
-            </w:r>
-          </w:p>
-        </w:tc>
-        <w:tc>
-          <w:tcPr>
-            <w:tcW w:type="dxa" w:w="1534"/>
-            <w:tcBorders>
-              <w:top w:val="single" w:color="B9C2CC" w:sz="4"/>
-              <w:left w:val="single" w:color="B9C2CC" w:sz="4"/>
-              <w:bottom w:val="single" w:color="B9C2CC" w:sz="4"/>
-              <w:right w:val="single" w:color="B9C2CC" w:sz="4"/>
-            </w:tcBorders>
-            <w:shd w:fill="EFE7D8" w:color="auto" w:val="clear"/>
-            <w:tcMar>
-              <w:top w:type="dxa" w:w="60"/>
-              <w:left w:type="dxa" w:w="100"/>
-              <w:bottom w:type="dxa" w:w="60"/>
-              <w:right w:type="dxa" w:w="100"/>
-            </w:tcMar>
-            <w:vAlign w:val="center"/>
-          </w:tcPr>
-          <w:p>
-            <w:pPr>
-              <w:keepNext/>
-              <w:spacing w:after="0" w:line="276"/>
-              <w:jc w:val="left"/>
-            </w:pPr>
-            <w:r>
-              <w:rPr>
-                <w:b/>
-                <w:bCs/>
-                <w:color w:val="1F2933"/>
-                <w:sz w:val="19"/>
-                <w:szCs w:val="19"/>
-              </w:rPr>
-              <w:t xml:space="preserve">วันที่</w:t>
-            </w:r>
-          </w:p>
-        </w:tc>
-      </w:tr>
-      <w:tr>
-        <w:trPr>
-          <w:cantSplit/>
-          <w:tblHeader w:val="false"/>
-        </w:trPr>
-        <w:tc>
-          <w:tcPr>
-            <w:tcW w:type="dxa" w:w="3821"/>
-            <w:tcBorders>
-              <w:top w:val="single" w:color="B9C2CC" w:sz="4"/>
-              <w:left w:val="single" w:color="B9C2CC" w:sz="4"/>
-              <w:bottom w:val="single" w:color="B9C2CC" w:sz="4"/>
-              <w:right w:val="single" w:color="B9C2CC" w:sz="4"/>
-            </w:tcBorders>
-            <w:tcMar>
-              <w:top w:type="dxa" w:w="60"/>
-              <w:left w:type="dxa" w:w="100"/>
-              <w:bottom w:type="dxa" w:w="60"/>
-              <w:right w:type="dxa" w:w="100"/>
-            </w:tcMar>
-            <w:vAlign w:val="center"/>
-          </w:tcPr>
-          <w:p>
-            <w:pPr>
-              <w:keepNext/>
-              <w:spacing w:after="0" w:line="276"/>
-              <w:jc w:val="left"/>
-            </w:pPr>
-            <w:r>
-              <w:rPr>
-                <w:color w:val="1F2933"/>
-                <w:sz w:val="19"/>
-                <w:szCs w:val="19"/>
-              </w:rPr>
-              <w:t xml:space="preserve">ผู้จัดทำ</w:t>
-            </w:r>
-          </w:p>
-        </w:tc>
-        <w:tc>
-          <w:tcPr>
-            <w:tcW w:type="dxa" w:w="2258"/>
-            <w:tcBorders>
-              <w:top w:val="single" w:color="B9C2CC" w:sz="4"/>
-              <w:left w:val="single" w:color="B9C2CC" w:sz="4"/>
-              <w:bottom w:val="single" w:color="B9C2CC" w:sz="4"/>
-              <w:right w:val="single" w:color="B9C2CC" w:sz="4"/>
-            </w:tcBorders>
-            <w:tcMar>
-              <w:top w:type="dxa" w:w="60"/>
-              <w:left w:type="dxa" w:w="100"/>
-              <w:bottom w:type="dxa" w:w="60"/>
-              <w:right w:type="dxa" w:w="100"/>
-            </w:tcMar>
-            <w:vAlign w:val="center"/>
-          </w:tcPr>
-          <w:p>
-            <w:pPr>
-              <w:keepNext/>
-              <w:spacing w:after="0" w:line="276"/>
-              <w:jc w:val="left"/>
-            </w:pPr>
-          </w:p>
-        </w:tc>
-        <w:tc>
-          <w:tcPr>
-            <w:tcW w:type="dxa" w:w="1413"/>
-            <w:tcBorders>
-              <w:top w:val="single" w:color="B9C2CC" w:sz="4"/>
-              <w:left w:val="single" w:color="B9C2CC" w:sz="4"/>
-              <w:bottom w:val="single" w:color="B9C2CC" w:sz="4"/>
-              <w:right w:val="single" w:color="B9C2CC" w:sz="4"/>
-            </w:tcBorders>
-            <w:tcMar>
-              <w:top w:type="dxa" w:w="60"/>
-              <w:left w:type="dxa" w:w="100"/>
-              <w:bottom w:type="dxa" w:w="60"/>
-              <w:right w:type="dxa" w:w="100"/>
-            </w:tcMar>
-            <w:vAlign w:val="center"/>
-          </w:tcPr>
-          <w:p>
-            <w:pPr>
-              <w:keepNext/>
-              <w:spacing w:after="0" w:line="276"/>
-              <w:jc w:val="left"/>
-            </w:pPr>
-          </w:p>
-        </w:tc>
-        <w:tc>
-          <w:tcPr>
-            <w:tcW w:type="dxa" w:w="1534"/>
-            <w:tcBorders>
-              <w:top w:val="single" w:color="B9C2CC" w:sz="4"/>
-              <w:left w:val="single" w:color="B9C2CC" w:sz="4"/>
-              <w:bottom w:val="single" w:color="B9C2CC" w:sz="4"/>
-              <w:right w:val="single" w:color="B9C2CC" w:sz="4"/>
-            </w:tcBorders>
-            <w:tcMar>
-              <w:top w:type="dxa" w:w="60"/>
-              <w:left w:type="dxa" w:w="100"/>
-              <w:bottom w:type="dxa" w:w="60"/>
-              <w:right w:type="dxa" w:w="100"/>
-            </w:tcMar>
-            <w:vAlign w:val="center"/>
-          </w:tcPr>
-          <w:p>
-            <w:pPr>
-              <w:keepNext/>
-              <w:spacing w:after="0" w:line="276"/>
-              <w:jc w:val="left"/>
-            </w:pPr>
-          </w:p>
-        </w:tc>
-      </w:tr>
-      <w:tr>
-        <w:trPr>
-          <w:cantSplit/>
-          <w:tblHeader w:val="false"/>
-        </w:trPr>
-        <w:tc>
-          <w:tcPr>
-            <w:tcW w:type="dxa" w:w="3821"/>
-            <w:tcBorders>
-              <w:top w:val="single" w:color="B9C2CC" w:sz="4"/>
-              <w:left w:val="single" w:color="B9C2CC" w:sz="4"/>
-              <w:bottom w:val="single" w:color="B9C2CC" w:sz="4"/>
-              <w:right w:val="single" w:color="B9C2CC" w:sz="4"/>
-            </w:tcBorders>
-            <w:tcMar>
-              <w:top w:type="dxa" w:w="60"/>
-              <w:left w:type="dxa" w:w="100"/>
-              <w:bottom w:type="dxa" w:w="60"/>
-              <w:right w:type="dxa" w:w="100"/>
-            </w:tcMar>
-            <w:vAlign w:val="center"/>
-          </w:tcPr>
-          <w:p>
-            <w:pPr>
-              <w:keepNext/>
-              <w:spacing w:after="0" w:line="276"/>
-              <w:jc w:val="left"/>
-            </w:pPr>
-            <w:r>
-              <w:rPr>
-                <w:color w:val="1F2933"/>
-                <w:sz w:val="19"/>
-                <w:szCs w:val="19"/>
-              </w:rPr>
-              <w:t xml:space="preserve">ผู้ตรวจสอบ</w:t>
-            </w:r>
-          </w:p>
-        </w:tc>
-        <w:tc>
-          <w:tcPr>
-            <w:tcW w:type="dxa" w:w="2258"/>
-            <w:tcBorders>
-              <w:top w:val="single" w:color="B9C2CC" w:sz="4"/>
-              <w:left w:val="single" w:color="B9C2CC" w:sz="4"/>
-              <w:bottom w:val="single" w:color="B9C2CC" w:sz="4"/>
-              <w:right w:val="single" w:color="B9C2CC" w:sz="4"/>
-            </w:tcBorders>
-            <w:tcMar>
-              <w:top w:type="dxa" w:w="60"/>
-              <w:left w:type="dxa" w:w="100"/>
-              <w:bottom w:type="dxa" w:w="60"/>
-              <w:right w:type="dxa" w:w="100"/>
-            </w:tcMar>
-            <w:vAlign w:val="center"/>
-          </w:tcPr>
-          <w:p>
-            <w:pPr>
-              <w:keepNext/>
-              <w:spacing w:after="0" w:line="276"/>
-              <w:jc w:val="left"/>
-            </w:pPr>
-          </w:p>
-        </w:tc>
-        <w:tc>
-          <w:tcPr>
-            <w:tcW w:type="dxa" w:w="1413"/>
-            <w:tcBorders>
-              <w:top w:val="single" w:color="B9C2CC" w:sz="4"/>
-              <w:left w:val="single" w:color="B9C2CC" w:sz="4"/>
-              <w:bottom w:val="single" w:color="B9C2CC" w:sz="4"/>
-              <w:right w:val="single" w:color="B9C2CC" w:sz="4"/>
-            </w:tcBorders>
-            <w:tcMar>
-              <w:top w:type="dxa" w:w="60"/>
-              <w:left w:type="dxa" w:w="100"/>
-              <w:bottom w:type="dxa" w:w="60"/>
-              <w:right w:type="dxa" w:w="100"/>
-            </w:tcMar>
-            <w:vAlign w:val="center"/>
-          </w:tcPr>
-          <w:p>
-            <w:pPr>
-              <w:keepNext/>
-              <w:spacing w:after="0" w:line="276"/>
-              <w:jc w:val="left"/>
-            </w:pPr>
-          </w:p>
-        </w:tc>
-        <w:tc>
-          <w:tcPr>
-            <w:tcW w:type="dxa" w:w="1534"/>
-            <w:tcBorders>
-              <w:top w:val="single" w:color="B9C2CC" w:sz="4"/>
-              <w:left w:val="single" w:color="B9C2CC" w:sz="4"/>
-              <w:bottom w:val="single" w:color="B9C2CC" w:sz="4"/>
-              <w:right w:val="single" w:color="B9C2CC" w:sz="4"/>
-            </w:tcBorders>
-            <w:tcMar>
-              <w:top w:type="dxa" w:w="60"/>
-              <w:left w:type="dxa" w:w="100"/>
-              <w:bottom w:type="dxa" w:w="60"/>
-              <w:right w:type="dxa" w:w="100"/>
-            </w:tcMar>
-            <w:vAlign w:val="center"/>
-          </w:tcPr>
-          <w:p>
-            <w:pPr>
-              <w:keepNext/>
-              <w:spacing w:after="0" w:line="276"/>
-              <w:jc w:val="left"/>
-            </w:pPr>
-          </w:p>
-        </w:tc>
-      </w:tr>
-      <w:tr>
-        <w:trPr>
-          <w:cantSplit/>
-          <w:tblHeader w:val="false"/>
-        </w:trPr>
-        <w:tc>
-          <w:tcPr>
-            <w:tcW w:type="dxa" w:w="3821"/>
-            <w:tcBorders>
-              <w:top w:val="single" w:color="B9C2CC" w:sz="4"/>
-              <w:left w:val="single" w:color="B9C2CC" w:sz="4"/>
-              <w:bottom w:val="single" w:color="B9C2CC" w:sz="4"/>
-              <w:right w:val="single" w:color="B9C2CC" w:sz="4"/>
-            </w:tcBorders>
-            <w:tcMar>
-              <w:top w:type="dxa" w:w="60"/>
-              <w:left w:type="dxa" w:w="100"/>
-              <w:bottom w:type="dxa" w:w="60"/>
-              <w:right w:type="dxa" w:w="100"/>
-            </w:tcMar>
-            <w:vAlign w:val="center"/>
-          </w:tcPr>
-          <w:p>
-            <w:pPr>
-              <w:keepNext w:val="false"/>
-              <w:spacing w:after="0" w:line="276"/>
-              <w:jc w:val="left"/>
-            </w:pPr>
-            <w:r>
-              <w:rPr>
-                <w:color w:val="1F2933"/>
-                <w:sz w:val="19"/>
-                <w:szCs w:val="19"/>
-              </w:rPr>
-              <w:t xml:space="preserve">อาจารย์ผู้สอน</w:t>
-            </w:r>
-          </w:p>
-        </w:tc>
-        <w:tc>
-          <w:tcPr>
-            <w:tcW w:type="dxa" w:w="2258"/>
-            <w:tcBorders>
-              <w:top w:val="single" w:color="B9C2CC" w:sz="4"/>
-              <w:left w:val="single" w:color="B9C2CC" w:sz="4"/>
-              <w:bottom w:val="single" w:color="B9C2CC" w:sz="4"/>
-              <w:right w:val="single" w:color="B9C2CC" w:sz="4"/>
-            </w:tcBorders>
-            <w:tcMar>
-              <w:top w:type="dxa" w:w="60"/>
-              <w:left w:type="dxa" w:w="100"/>
-              <w:bottom w:type="dxa" w:w="60"/>
-              <w:right w:type="dxa" w:w="100"/>
-            </w:tcMar>
-            <w:vAlign w:val="center"/>
-          </w:tcPr>
-          <w:p>
-            <w:pPr>
-              <w:keepNext w:val="false"/>
-              <w:spacing w:after="0" w:line="276"/>
-              <w:jc w:val="left"/>
-            </w:pPr>
-          </w:p>
-        </w:tc>
-        <w:tc>
-          <w:tcPr>
-            <w:tcW w:type="dxa" w:w="1413"/>
-            <w:tcBorders>
-              <w:top w:val="single" w:color="B9C2CC" w:sz="4"/>
-              <w:left w:val="single" w:color="B9C2CC" w:sz="4"/>
-              <w:bottom w:val="single" w:color="B9C2CC" w:sz="4"/>
-              <w:right w:val="single" w:color="B9C2CC" w:sz="4"/>
-            </w:tcBorders>
-            <w:tcMar>
-              <w:top w:type="dxa" w:w="60"/>
-              <w:left w:type="dxa" w:w="100"/>
-              <w:bottom w:type="dxa" w:w="60"/>
-              <w:right w:type="dxa" w:w="100"/>
-            </w:tcMar>
-            <w:vAlign w:val="center"/>
-          </w:tcPr>
-          <w:p>
-            <w:pPr>
-              <w:keepNext w:val="false"/>
-              <w:spacing w:after="0" w:line="276"/>
-              <w:jc w:val="left"/>
-            </w:pPr>
-          </w:p>
-        </w:tc>
-        <w:tc>
-          <w:tcPr>
-            <w:tcW w:type="dxa" w:w="1534"/>
-            <w:tcBorders>
-              <w:top w:val="single" w:color="B9C2CC" w:sz="4"/>
-              <w:left w:val="single" w:color="B9C2CC" w:sz="4"/>
-              <w:bottom w:val="single" w:color="B9C2CC" w:sz="4"/>
-              <w:right w:val="single" w:color="B9C2CC" w:sz="4"/>
-            </w:tcBorders>
-            <w:tcMar>
-              <w:top w:type="dxa" w:w="60"/>
-              <w:left w:type="dxa" w:w="100"/>
-              <w:bottom w:type="dxa" w:w="60"/>
-              <w:right w:type="dxa" w:w="100"/>
-            </w:tcMar>
-            <w:vAlign w:val="center"/>
-          </w:tcPr>
-          <w:p>
-            <w:pPr>
-              <w:keepNext w:val="false"/>
-              <w:spacing w:after="0" w:line="276"/>
-              <w:jc w:val="left"/>
-            </w:pPr>
           </w:p>
         </w:tc>
       </w:tr>

</xml_diff>